<commit_message>
fix(render): every Markdown table in the package was unstyled
Measured in headless Chromium: sources emit bare <table> while assets/print.css
targets table.tbl, so all ~30 tables across the 14 documents rendered with 0px
borders, no navy header, no zebra striping and 1px padding — in PDF, HTML and
DOCX alike. Fixed in md(): the generated <table> now carries class=tbl.

Also fixed the DOCX pipeline, which had no table styling at all: header row
shaded #1E3A5F with bold white text, 'Table Grid' style (with a manual
w:tblBorders fallback for templates lacking that style), zebra rows, and the
header row set to repeat across page breaks.

Guarded by a new audit rule (check_tables_styled): any <table> without class=tbl
in the published HTML, or a missing table.tbl rule in print.css, fails the
verification; proven by a negative test (removing the class → exit 1). Rebuilt
all 14 documents, 6 decks and the hub.

Co-authored-by: arena-agent <297053741+arena-agent@users.noreply.github.com>
</commit_message>
<xml_diff>
--- a/docx/program-overview.docx
+++ b/docx/program-overview.docx
@@ -280,14 +280,27 @@
         <w:tblW w:type="auto" w:w="0"/>
         <w:jc w:val="center"/>
         <w:tblLook w:firstRow="0" w:lastRow="0" w:firstColumn="0" w:lastColumn="0"/>
+        <w:tblBorders>
+          <w:top w:val="single" w:sz="4" w:color="C9D3DE"/>
+          <w:left w:val="single" w:sz="4" w:color="C9D3DE"/>
+          <w:bottom w:val="single" w:sz="4" w:color="C9D3DE"/>
+          <w:right w:val="single" w:sz="4" w:color="C9D3DE"/>
+          <w:insideH w:val="single" w:sz="4" w:color="C9D3DE"/>
+          <w:insideV w:val="single" w:sz="4" w:color="C9D3DE"/>
+        </w:tblBorders>
         <w:bidiVisual/>
       </w:tblPr>
       <w:tblGrid>
         <w:gridCol w:w="7920"/>
       </w:tblGrid>
       <w:tr>
-        <w:tc>
-          <w:tcPr/>
+        <w:trPr>
+          <w:tblHeader w:val="true"/>
+        </w:trPr>
+        <w:tc>
+          <w:tcPr>
+            <w:shd w:val="clear" w:color="auto" w:fill="1E3A5F"/>
+          </w:tcPr>
           <w:p>
             <w:pPr>
               <w:pStyle w:val="Compact"/>
@@ -296,6 +309,8 @@
             </w:pPr>
             <w:r>
               <w:rPr>
+                <w:b/>
+                <w:color w:val="FFFFFF"/>
                 <w:sz w:val="22"/>
                 <w:rtl/>
               </w:rPr>
@@ -506,6 +521,15 @@
         <w:tblStyle w:val="Table"/>
         <w:tblW w:type="auto" w:w="0"/>
         <w:tblLook w:firstRow="1" w:lastRow="0" w:firstColumn="0" w:lastColumn="0" w:noHBand="0" w:noVBand="0" w:val="0020"/>
+        <w:jc w:val="center"/>
+        <w:tblBorders>
+          <w:top w:val="single" w:sz="4" w:color="C9D3DE"/>
+          <w:left w:val="single" w:sz="4" w:color="C9D3DE"/>
+          <w:bottom w:val="single" w:sz="4" w:color="C9D3DE"/>
+          <w:right w:val="single" w:sz="4" w:color="C9D3DE"/>
+          <w:insideH w:val="single" w:sz="4" w:color="C9D3DE"/>
+          <w:insideV w:val="single" w:sz="4" w:color="C9D3DE"/>
+        </w:tblBorders>
         <w:bidiVisual/>
       </w:tblPr>
       <w:tblGrid>
@@ -517,14 +541,18 @@
           <w:tblHeader w:val="on"/>
         </w:trPr>
         <w:tc>
-          <w:tcPr/>
-          <w:p>
-            <w:pPr>
-              <w:pStyle w:val="Compact"/>
-              <w:bidi/>
-            </w:pPr>
-            <w:r>
-              <w:rPr>
+          <w:tcPr>
+            <w:shd w:val="clear" w:color="auto" w:fill="1E3A5F"/>
+          </w:tcPr>
+          <w:p>
+            <w:pPr>
+              <w:pStyle w:val="Compact"/>
+              <w:bidi/>
+            </w:pPr>
+            <w:r>
+              <w:rPr>
+                <w:b/>
+                <w:color w:val="FFFFFF"/>
                 <w:sz w:val="22"/>
                 <w:rtl/>
               </w:rPr>
@@ -533,14 +561,18 @@
           </w:p>
         </w:tc>
         <w:tc>
-          <w:tcPr/>
-          <w:p>
-            <w:pPr>
-              <w:pStyle w:val="Compact"/>
-              <w:bidi/>
-            </w:pPr>
-            <w:r>
-              <w:rPr>
+          <w:tcPr>
+            <w:shd w:val="clear" w:color="auto" w:fill="1E3A5F"/>
+          </w:tcPr>
+          <w:p>
+            <w:pPr>
+              <w:pStyle w:val="Compact"/>
+              <w:bidi/>
+            </w:pPr>
+            <w:r>
+              <w:rPr>
+                <w:b/>
+                <w:color w:val="FFFFFF"/>
                 <w:sz w:val="22"/>
                 <w:rtl/>
               </w:rPr>
@@ -585,7 +617,9 @@
       </w:tr>
       <w:tr>
         <w:tc>
-          <w:tcPr/>
+          <w:tcPr>
+            <w:shd w:val="clear" w:color="auto" w:fill="FAFCFE"/>
+          </w:tcPr>
           <w:p>
             <w:pPr>
               <w:pStyle w:val="Compact"/>
@@ -601,7 +635,9 @@
           </w:p>
         </w:tc>
         <w:tc>
-          <w:tcPr/>
+          <w:tcPr>
+            <w:shd w:val="clear" w:color="auto" w:fill="FAFCFE"/>
+          </w:tcPr>
           <w:p>
             <w:pPr>
               <w:pStyle w:val="Compact"/>
@@ -697,7 +733,9 @@
       </w:tr>
       <w:tr>
         <w:tc>
-          <w:tcPr/>
+          <w:tcPr>
+            <w:shd w:val="clear" w:color="auto" w:fill="FAFCFE"/>
+          </w:tcPr>
           <w:p>
             <w:pPr>
               <w:pStyle w:val="Compact"/>
@@ -713,7 +751,9 @@
           </w:p>
         </w:tc>
         <w:tc>
-          <w:tcPr/>
+          <w:tcPr>
+            <w:shd w:val="clear" w:color="auto" w:fill="FAFCFE"/>
+          </w:tcPr>
           <w:p>
             <w:pPr>
               <w:pStyle w:val="Compact"/>
@@ -765,7 +805,9 @@
       </w:tr>
       <w:tr>
         <w:tc>
-          <w:tcPr/>
+          <w:tcPr>
+            <w:shd w:val="clear" w:color="auto" w:fill="FAFCFE"/>
+          </w:tcPr>
           <w:p>
             <w:pPr>
               <w:pStyle w:val="Compact"/>
@@ -781,7 +823,9 @@
           </w:p>
         </w:tc>
         <w:tc>
-          <w:tcPr/>
+          <w:tcPr>
+            <w:shd w:val="clear" w:color="auto" w:fill="FAFCFE"/>
+          </w:tcPr>
           <w:p>
             <w:pPr>
               <w:pStyle w:val="Compact"/>
@@ -1008,6 +1052,15 @@
         <w:tblStyle w:val="Table"/>
         <w:tblW w:type="auto" w:w="0"/>
         <w:tblLook w:firstRow="1" w:lastRow="0" w:firstColumn="0" w:lastColumn="0" w:noHBand="0" w:noVBand="0" w:val="0020"/>
+        <w:jc w:val="center"/>
+        <w:tblBorders>
+          <w:top w:val="single" w:sz="4" w:color="C9D3DE"/>
+          <w:left w:val="single" w:sz="4" w:color="C9D3DE"/>
+          <w:bottom w:val="single" w:sz="4" w:color="C9D3DE"/>
+          <w:right w:val="single" w:sz="4" w:color="C9D3DE"/>
+          <w:insideH w:val="single" w:sz="4" w:color="C9D3DE"/>
+          <w:insideV w:val="single" w:sz="4" w:color="C9D3DE"/>
+        </w:tblBorders>
         <w:bidiVisual/>
       </w:tblPr>
       <w:tblGrid>
@@ -1021,14 +1074,18 @@
           <w:tblHeader w:val="on"/>
         </w:trPr>
         <w:tc>
-          <w:tcPr/>
-          <w:p>
-            <w:pPr>
-              <w:pStyle w:val="Compact"/>
-              <w:bidi/>
-            </w:pPr>
-            <w:r>
-              <w:rPr>
+          <w:tcPr>
+            <w:shd w:val="clear" w:color="auto" w:fill="1E3A5F"/>
+          </w:tcPr>
+          <w:p>
+            <w:pPr>
+              <w:pStyle w:val="Compact"/>
+              <w:bidi/>
+            </w:pPr>
+            <w:r>
+              <w:rPr>
+                <w:b/>
+                <w:color w:val="FFFFFF"/>
                 <w:sz w:val="22"/>
                 <w:rtl/>
               </w:rPr>
@@ -1037,14 +1094,18 @@
           </w:p>
         </w:tc>
         <w:tc>
-          <w:tcPr/>
-          <w:p>
-            <w:pPr>
-              <w:pStyle w:val="Compact"/>
-              <w:bidi/>
-            </w:pPr>
-            <w:r>
-              <w:rPr>
+          <w:tcPr>
+            <w:shd w:val="clear" w:color="auto" w:fill="1E3A5F"/>
+          </w:tcPr>
+          <w:p>
+            <w:pPr>
+              <w:pStyle w:val="Compact"/>
+              <w:bidi/>
+            </w:pPr>
+            <w:r>
+              <w:rPr>
+                <w:b/>
+                <w:color w:val="FFFFFF"/>
                 <w:sz w:val="22"/>
                 <w:rtl/>
               </w:rPr>
@@ -1053,14 +1114,18 @@
           </w:p>
         </w:tc>
         <w:tc>
-          <w:tcPr/>
-          <w:p>
-            <w:pPr>
-              <w:pStyle w:val="Compact"/>
-              <w:bidi/>
-            </w:pPr>
-            <w:r>
-              <w:rPr>
+          <w:tcPr>
+            <w:shd w:val="clear" w:color="auto" w:fill="1E3A5F"/>
+          </w:tcPr>
+          <w:p>
+            <w:pPr>
+              <w:pStyle w:val="Compact"/>
+              <w:bidi/>
+            </w:pPr>
+            <w:r>
+              <w:rPr>
+                <w:b/>
+                <w:color w:val="FFFFFF"/>
                 <w:sz w:val="22"/>
                 <w:rtl/>
               </w:rPr>
@@ -1069,14 +1134,18 @@
           </w:p>
         </w:tc>
         <w:tc>
-          <w:tcPr/>
-          <w:p>
-            <w:pPr>
-              <w:pStyle w:val="Compact"/>
-              <w:bidi/>
-            </w:pPr>
-            <w:r>
-              <w:rPr>
+          <w:tcPr>
+            <w:shd w:val="clear" w:color="auto" w:fill="1E3A5F"/>
+          </w:tcPr>
+          <w:p>
+            <w:pPr>
+              <w:pStyle w:val="Compact"/>
+              <w:bidi/>
+            </w:pPr>
+            <w:r>
+              <w:rPr>
+                <w:b/>
+                <w:color w:val="FFFFFF"/>
                 <w:sz w:val="22"/>
                 <w:rtl/>
               </w:rPr>
@@ -1155,7 +1224,9 @@
       </w:tr>
       <w:tr>
         <w:tc>
-          <w:tcPr/>
+          <w:tcPr>
+            <w:shd w:val="clear" w:color="auto" w:fill="FAFCFE"/>
+          </w:tcPr>
           <w:p>
             <w:pPr>
               <w:pStyle w:val="Compact"/>
@@ -1173,7 +1244,9 @@
           </w:p>
         </w:tc>
         <w:tc>
-          <w:tcPr/>
+          <w:tcPr>
+            <w:shd w:val="clear" w:color="auto" w:fill="FAFCFE"/>
+          </w:tcPr>
           <w:p>
             <w:pPr>
               <w:pStyle w:val="Compact"/>
@@ -1189,7 +1262,9 @@
           </w:p>
         </w:tc>
         <w:tc>
-          <w:tcPr/>
+          <w:tcPr>
+            <w:shd w:val="clear" w:color="auto" w:fill="FAFCFE"/>
+          </w:tcPr>
           <w:p>
             <w:pPr>
               <w:pStyle w:val="Compact"/>
@@ -1205,7 +1280,9 @@
           </w:p>
         </w:tc>
         <w:tc>
-          <w:tcPr/>
+          <w:tcPr>
+            <w:shd w:val="clear" w:color="auto" w:fill="FAFCFE"/>
+          </w:tcPr>
           <w:p>
             <w:pPr>
               <w:pStyle w:val="Compact"/>
@@ -1291,7 +1368,9 @@
       </w:tr>
       <w:tr>
         <w:tc>
-          <w:tcPr/>
+          <w:tcPr>
+            <w:shd w:val="clear" w:color="auto" w:fill="FAFCFE"/>
+          </w:tcPr>
           <w:p>
             <w:pPr>
               <w:pStyle w:val="Compact"/>
@@ -1309,7 +1388,9 @@
           </w:p>
         </w:tc>
         <w:tc>
-          <w:tcPr/>
+          <w:tcPr>
+            <w:shd w:val="clear" w:color="auto" w:fill="FAFCFE"/>
+          </w:tcPr>
           <w:p>
             <w:pPr>
               <w:pStyle w:val="Compact"/>
@@ -1325,7 +1406,9 @@
           </w:p>
         </w:tc>
         <w:tc>
-          <w:tcPr/>
+          <w:tcPr>
+            <w:shd w:val="clear" w:color="auto" w:fill="FAFCFE"/>
+          </w:tcPr>
           <w:p>
             <w:pPr>
               <w:pStyle w:val="Compact"/>
@@ -1341,7 +1424,9 @@
           </w:p>
         </w:tc>
         <w:tc>
-          <w:tcPr/>
+          <w:tcPr>
+            <w:shd w:val="clear" w:color="auto" w:fill="FAFCFE"/>
+          </w:tcPr>
           <w:p>
             <w:pPr>
               <w:pStyle w:val="Compact"/>
@@ -1427,7 +1512,9 @@
       </w:tr>
       <w:tr>
         <w:tc>
-          <w:tcPr/>
+          <w:tcPr>
+            <w:shd w:val="clear" w:color="auto" w:fill="FAFCFE"/>
+          </w:tcPr>
           <w:p>
             <w:pPr>
               <w:pStyle w:val="Compact"/>
@@ -1445,7 +1532,9 @@
           </w:p>
         </w:tc>
         <w:tc>
-          <w:tcPr/>
+          <w:tcPr>
+            <w:shd w:val="clear" w:color="auto" w:fill="FAFCFE"/>
+          </w:tcPr>
           <w:p>
             <w:pPr>
               <w:pStyle w:val="Compact"/>
@@ -1477,7 +1566,9 @@
           </w:p>
         </w:tc>
         <w:tc>
-          <w:tcPr/>
+          <w:tcPr>
+            <w:shd w:val="clear" w:color="auto" w:fill="FAFCFE"/>
+          </w:tcPr>
           <w:p>
             <w:pPr>
               <w:pStyle w:val="Compact"/>
@@ -1493,7 +1584,9 @@
           </w:p>
         </w:tc>
         <w:tc>
-          <w:tcPr/>
+          <w:tcPr>
+            <w:shd w:val="clear" w:color="auto" w:fill="FAFCFE"/>
+          </w:tcPr>
           <w:p>
             <w:pPr>
               <w:pStyle w:val="Compact"/>
@@ -1989,6 +2082,15 @@
         <w:tblStyle w:val="Table"/>
         <w:tblW w:type="auto" w:w="0"/>
         <w:tblLook w:firstRow="1" w:lastRow="0" w:firstColumn="0" w:lastColumn="0" w:noHBand="0" w:noVBand="0" w:val="0020"/>
+        <w:jc w:val="center"/>
+        <w:tblBorders>
+          <w:top w:val="single" w:sz="4" w:color="C9D3DE"/>
+          <w:left w:val="single" w:sz="4" w:color="C9D3DE"/>
+          <w:bottom w:val="single" w:sz="4" w:color="C9D3DE"/>
+          <w:right w:val="single" w:sz="4" w:color="C9D3DE"/>
+          <w:insideH w:val="single" w:sz="4" w:color="C9D3DE"/>
+          <w:insideV w:val="single" w:sz="4" w:color="C9D3DE"/>
+        </w:tblBorders>
         <w:bidiVisual/>
       </w:tblPr>
       <w:tblGrid>
@@ -2001,14 +2103,18 @@
           <w:tblHeader w:val="on"/>
         </w:trPr>
         <w:tc>
-          <w:tcPr/>
-          <w:p>
-            <w:pPr>
-              <w:pStyle w:val="Compact"/>
-              <w:bidi/>
-            </w:pPr>
-            <w:r>
-              <w:rPr>
+          <w:tcPr>
+            <w:shd w:val="clear" w:color="auto" w:fill="1E3A5F"/>
+          </w:tcPr>
+          <w:p>
+            <w:pPr>
+              <w:pStyle w:val="Compact"/>
+              <w:bidi/>
+            </w:pPr>
+            <w:r>
+              <w:rPr>
+                <w:b/>
+                <w:color w:val="FFFFFF"/>
                 <w:sz w:val="22"/>
                 <w:rtl/>
               </w:rPr>
@@ -2017,14 +2123,18 @@
           </w:p>
         </w:tc>
         <w:tc>
-          <w:tcPr/>
-          <w:p>
-            <w:pPr>
-              <w:pStyle w:val="Compact"/>
-              <w:bidi/>
-            </w:pPr>
-            <w:r>
-              <w:rPr>
+          <w:tcPr>
+            <w:shd w:val="clear" w:color="auto" w:fill="1E3A5F"/>
+          </w:tcPr>
+          <w:p>
+            <w:pPr>
+              <w:pStyle w:val="Compact"/>
+              <w:bidi/>
+            </w:pPr>
+            <w:r>
+              <w:rPr>
+                <w:b/>
+                <w:color w:val="FFFFFF"/>
                 <w:sz w:val="22"/>
                 <w:rtl/>
               </w:rPr>
@@ -2033,14 +2143,18 @@
           </w:p>
         </w:tc>
         <w:tc>
-          <w:tcPr/>
-          <w:p>
-            <w:pPr>
-              <w:pStyle w:val="Compact"/>
-              <w:bidi/>
-            </w:pPr>
-            <w:r>
-              <w:rPr>
+          <w:tcPr>
+            <w:shd w:val="clear" w:color="auto" w:fill="1E3A5F"/>
+          </w:tcPr>
+          <w:p>
+            <w:pPr>
+              <w:pStyle w:val="Compact"/>
+              <w:bidi/>
+            </w:pPr>
+            <w:r>
+              <w:rPr>
+                <w:b/>
+                <w:color w:val="FFFFFF"/>
                 <w:sz w:val="22"/>
                 <w:rtl/>
               </w:rPr>
@@ -2116,7 +2230,9 @@
       </w:tr>
       <w:tr>
         <w:tc>
-          <w:tcPr/>
+          <w:tcPr>
+            <w:shd w:val="clear" w:color="auto" w:fill="FAFCFE"/>
+          </w:tcPr>
           <w:p>
             <w:pPr>
               <w:pStyle w:val="Compact"/>
@@ -2132,7 +2248,9 @@
           </w:p>
         </w:tc>
         <w:tc>
-          <w:tcPr/>
+          <w:tcPr>
+            <w:shd w:val="clear" w:color="auto" w:fill="FAFCFE"/>
+          </w:tcPr>
           <w:p>
             <w:pPr>
               <w:pStyle w:val="Compact"/>
@@ -2163,7 +2281,9 @@
           </w:p>
         </w:tc>
         <w:tc>
-          <w:tcPr/>
+          <w:tcPr>
+            <w:shd w:val="clear" w:color="auto" w:fill="FAFCFE"/>
+          </w:tcPr>
           <w:p>
             <w:pPr>
               <w:pStyle w:val="Compact"/>
@@ -2232,7 +2352,9 @@
       </w:tr>
       <w:tr>
         <w:tc>
-          <w:tcPr/>
+          <w:tcPr>
+            <w:shd w:val="clear" w:color="auto" w:fill="FAFCFE"/>
+          </w:tcPr>
           <w:p>
             <w:pPr>
               <w:pStyle w:val="Compact"/>
@@ -2248,7 +2370,9 @@
           </w:p>
         </w:tc>
         <w:tc>
-          <w:tcPr/>
+          <w:tcPr>
+            <w:shd w:val="clear" w:color="auto" w:fill="FAFCFE"/>
+          </w:tcPr>
           <w:p>
             <w:pPr>
               <w:pStyle w:val="Compact"/>
@@ -2279,7 +2403,9 @@
           </w:p>
         </w:tc>
         <w:tc>
-          <w:tcPr/>
+          <w:tcPr>
+            <w:shd w:val="clear" w:color="auto" w:fill="FAFCFE"/>
+          </w:tcPr>
           <w:p>
             <w:pPr>
               <w:pStyle w:val="Compact"/>
@@ -2386,6 +2512,15 @@
         <w:tblStyle w:val="Table"/>
         <w:tblW w:type="auto" w:w="0"/>
         <w:tblLook w:firstRow="1" w:lastRow="0" w:firstColumn="0" w:lastColumn="0" w:noHBand="0" w:noVBand="0" w:val="0020"/>
+        <w:jc w:val="center"/>
+        <w:tblBorders>
+          <w:top w:val="single" w:sz="4" w:color="C9D3DE"/>
+          <w:left w:val="single" w:sz="4" w:color="C9D3DE"/>
+          <w:bottom w:val="single" w:sz="4" w:color="C9D3DE"/>
+          <w:right w:val="single" w:sz="4" w:color="C9D3DE"/>
+          <w:insideH w:val="single" w:sz="4" w:color="C9D3DE"/>
+          <w:insideV w:val="single" w:sz="4" w:color="C9D3DE"/>
+        </w:tblBorders>
         <w:bidiVisual/>
       </w:tblPr>
       <w:tblGrid>
@@ -2398,14 +2533,18 @@
           <w:tblHeader w:val="on"/>
         </w:trPr>
         <w:tc>
-          <w:tcPr/>
-          <w:p>
-            <w:pPr>
-              <w:pStyle w:val="Compact"/>
-              <w:bidi/>
-            </w:pPr>
-            <w:r>
-              <w:rPr>
+          <w:tcPr>
+            <w:shd w:val="clear" w:color="auto" w:fill="1E3A5F"/>
+          </w:tcPr>
+          <w:p>
+            <w:pPr>
+              <w:pStyle w:val="Compact"/>
+              <w:bidi/>
+            </w:pPr>
+            <w:r>
+              <w:rPr>
+                <w:b/>
+                <w:color w:val="FFFFFF"/>
                 <w:sz w:val="22"/>
                 <w:rtl/>
               </w:rPr>
@@ -2414,14 +2553,18 @@
           </w:p>
         </w:tc>
         <w:tc>
-          <w:tcPr/>
-          <w:p>
-            <w:pPr>
-              <w:pStyle w:val="Compact"/>
-              <w:bidi/>
-            </w:pPr>
-            <w:r>
-              <w:rPr>
+          <w:tcPr>
+            <w:shd w:val="clear" w:color="auto" w:fill="1E3A5F"/>
+          </w:tcPr>
+          <w:p>
+            <w:pPr>
+              <w:pStyle w:val="Compact"/>
+              <w:bidi/>
+            </w:pPr>
+            <w:r>
+              <w:rPr>
+                <w:b/>
+                <w:color w:val="FFFFFF"/>
                 <w:sz w:val="22"/>
                 <w:rtl/>
               </w:rPr>
@@ -2430,14 +2573,18 @@
           </w:p>
         </w:tc>
         <w:tc>
-          <w:tcPr/>
-          <w:p>
-            <w:pPr>
-              <w:pStyle w:val="Compact"/>
-              <w:bidi/>
-            </w:pPr>
-            <w:r>
-              <w:rPr>
+          <w:tcPr>
+            <w:shd w:val="clear" w:color="auto" w:fill="1E3A5F"/>
+          </w:tcPr>
+          <w:p>
+            <w:pPr>
+              <w:pStyle w:val="Compact"/>
+              <w:bidi/>
+            </w:pPr>
+            <w:r>
+              <w:rPr>
+                <w:b/>
+                <w:color w:val="FFFFFF"/>
                 <w:sz w:val="22"/>
                 <w:rtl/>
               </w:rPr>
@@ -2514,7 +2661,9 @@
       </w:tr>
       <w:tr>
         <w:tc>
-          <w:tcPr/>
+          <w:tcPr>
+            <w:shd w:val="clear" w:color="auto" w:fill="FAFCFE"/>
+          </w:tcPr>
           <w:p>
             <w:pPr>
               <w:pStyle w:val="Compact"/>
@@ -2532,7 +2681,9 @@
           </w:p>
         </w:tc>
         <w:tc>
-          <w:tcPr/>
+          <w:tcPr>
+            <w:shd w:val="clear" w:color="auto" w:fill="FAFCFE"/>
+          </w:tcPr>
           <w:p>
             <w:pPr>
               <w:pStyle w:val="Compact"/>
@@ -2548,7 +2699,9 @@
           </w:p>
         </w:tc>
         <w:tc>
-          <w:tcPr/>
+          <w:tcPr>
+            <w:shd w:val="clear" w:color="auto" w:fill="FAFCFE"/>
+          </w:tcPr>
           <w:p>
             <w:pPr>
               <w:pStyle w:val="Compact"/>
@@ -2633,7 +2786,9 @@
       </w:tr>
       <w:tr>
         <w:tc>
-          <w:tcPr/>
+          <w:tcPr>
+            <w:shd w:val="clear" w:color="auto" w:fill="FAFCFE"/>
+          </w:tcPr>
           <w:p>
             <w:pPr>
               <w:pStyle w:val="Compact"/>
@@ -2651,7 +2806,9 @@
           </w:p>
         </w:tc>
         <w:tc>
-          <w:tcPr/>
+          <w:tcPr>
+            <w:shd w:val="clear" w:color="auto" w:fill="FAFCFE"/>
+          </w:tcPr>
           <w:p>
             <w:pPr>
               <w:pStyle w:val="Compact"/>
@@ -2696,7 +2853,9 @@
           </w:p>
         </w:tc>
         <w:tc>
-          <w:tcPr/>
+          <w:tcPr>
+            <w:shd w:val="clear" w:color="auto" w:fill="FAFCFE"/>
+          </w:tcPr>
           <w:p>
             <w:pPr>
               <w:pStyle w:val="Compact"/>
@@ -2817,7 +2976,9 @@
       </w:tr>
       <w:tr>
         <w:tc>
-          <w:tcPr/>
+          <w:tcPr>
+            <w:shd w:val="clear" w:color="auto" w:fill="FAFCFE"/>
+          </w:tcPr>
           <w:p>
             <w:pPr>
               <w:pStyle w:val="Compact"/>
@@ -2835,7 +2996,9 @@
           </w:p>
         </w:tc>
         <w:tc>
-          <w:tcPr/>
+          <w:tcPr>
+            <w:shd w:val="clear" w:color="auto" w:fill="FAFCFE"/>
+          </w:tcPr>
           <w:p>
             <w:pPr>
               <w:pStyle w:val="Compact"/>
@@ -2851,7 +3014,9 @@
           </w:p>
         </w:tc>
         <w:tc>
-          <w:tcPr/>
+          <w:tcPr>
+            <w:shd w:val="clear" w:color="auto" w:fill="FAFCFE"/>
+          </w:tcPr>
           <w:p>
             <w:pPr>
               <w:pStyle w:val="Compact"/>
@@ -3000,6 +3165,15 @@
         <w:tblStyle w:val="Table"/>
         <w:tblW w:type="auto" w:w="0"/>
         <w:tblLook w:firstRow="1" w:lastRow="0" w:firstColumn="0" w:lastColumn="0" w:noHBand="0" w:noVBand="0" w:val="0020"/>
+        <w:jc w:val="center"/>
+        <w:tblBorders>
+          <w:top w:val="single" w:sz="4" w:color="C9D3DE"/>
+          <w:left w:val="single" w:sz="4" w:color="C9D3DE"/>
+          <w:bottom w:val="single" w:sz="4" w:color="C9D3DE"/>
+          <w:right w:val="single" w:sz="4" w:color="C9D3DE"/>
+          <w:insideH w:val="single" w:sz="4" w:color="C9D3DE"/>
+          <w:insideV w:val="single" w:sz="4" w:color="C9D3DE"/>
+        </w:tblBorders>
         <w:bidiVisual/>
       </w:tblPr>
       <w:tblGrid>
@@ -3012,14 +3186,18 @@
           <w:tblHeader w:val="on"/>
         </w:trPr>
         <w:tc>
-          <w:tcPr/>
-          <w:p>
-            <w:pPr>
-              <w:pStyle w:val="Compact"/>
-              <w:bidi/>
-            </w:pPr>
-            <w:r>
-              <w:rPr>
+          <w:tcPr>
+            <w:shd w:val="clear" w:color="auto" w:fill="1E3A5F"/>
+          </w:tcPr>
+          <w:p>
+            <w:pPr>
+              <w:pStyle w:val="Compact"/>
+              <w:bidi/>
+            </w:pPr>
+            <w:r>
+              <w:rPr>
+                <w:b/>
+                <w:color w:val="FFFFFF"/>
                 <w:sz w:val="22"/>
                 <w:rtl/>
               </w:rPr>
@@ -3028,14 +3206,18 @@
           </w:p>
         </w:tc>
         <w:tc>
-          <w:tcPr/>
-          <w:p>
-            <w:pPr>
-              <w:pStyle w:val="Compact"/>
-              <w:bidi/>
-            </w:pPr>
-            <w:r>
-              <w:rPr>
+          <w:tcPr>
+            <w:shd w:val="clear" w:color="auto" w:fill="1E3A5F"/>
+          </w:tcPr>
+          <w:p>
+            <w:pPr>
+              <w:pStyle w:val="Compact"/>
+              <w:bidi/>
+            </w:pPr>
+            <w:r>
+              <w:rPr>
+                <w:b/>
+                <w:color w:val="FFFFFF"/>
                 <w:sz w:val="22"/>
                 <w:rtl/>
               </w:rPr>
@@ -3044,14 +3226,18 @@
           </w:p>
         </w:tc>
         <w:tc>
-          <w:tcPr/>
-          <w:p>
-            <w:pPr>
-              <w:pStyle w:val="Compact"/>
-              <w:bidi/>
-            </w:pPr>
-            <w:r>
-              <w:rPr>
+          <w:tcPr>
+            <w:shd w:val="clear" w:color="auto" w:fill="1E3A5F"/>
+          </w:tcPr>
+          <w:p>
+            <w:pPr>
+              <w:pStyle w:val="Compact"/>
+              <w:bidi/>
+            </w:pPr>
+            <w:r>
+              <w:rPr>
+                <w:b/>
+                <w:color w:val="FFFFFF"/>
                 <w:sz w:val="22"/>
                 <w:rtl/>
               </w:rPr>
@@ -3112,7 +3298,9 @@
       </w:tr>
       <w:tr>
         <w:tc>
-          <w:tcPr/>
+          <w:tcPr>
+            <w:shd w:val="clear" w:color="auto" w:fill="FAFCFE"/>
+          </w:tcPr>
           <w:p>
             <w:pPr>
               <w:pStyle w:val="Compact"/>
@@ -3128,7 +3316,9 @@
           </w:p>
         </w:tc>
         <w:tc>
-          <w:tcPr/>
+          <w:tcPr>
+            <w:shd w:val="clear" w:color="auto" w:fill="FAFCFE"/>
+          </w:tcPr>
           <w:p>
             <w:pPr>
               <w:pStyle w:val="Compact"/>
@@ -3144,7 +3334,9 @@
           </w:p>
         </w:tc>
         <w:tc>
-          <w:tcPr/>
+          <w:tcPr>
+            <w:shd w:val="clear" w:color="auto" w:fill="FAFCFE"/>
+          </w:tcPr>
           <w:p>
             <w:pPr>
               <w:pStyle w:val="Compact"/>
@@ -3241,7 +3433,9 @@
       </w:tr>
       <w:tr>
         <w:tc>
-          <w:tcPr/>
+          <w:tcPr>
+            <w:shd w:val="clear" w:color="auto" w:fill="FAFCFE"/>
+          </w:tcPr>
           <w:p>
             <w:pPr>
               <w:pStyle w:val="Compact"/>
@@ -3257,7 +3451,9 @@
           </w:p>
         </w:tc>
         <w:tc>
-          <w:tcPr/>
+          <w:tcPr>
+            <w:shd w:val="clear" w:color="auto" w:fill="FAFCFE"/>
+          </w:tcPr>
           <w:p>
             <w:pPr>
               <w:pStyle w:val="Compact"/>
@@ -3273,7 +3469,9 @@
           </w:p>
         </w:tc>
         <w:tc>
-          <w:tcPr/>
+          <w:tcPr>
+            <w:shd w:val="clear" w:color="auto" w:fill="FAFCFE"/>
+          </w:tcPr>
           <w:p>
             <w:pPr>
               <w:pStyle w:val="Compact"/>
@@ -3341,7 +3539,9 @@
       </w:tr>
       <w:tr>
         <w:tc>
-          <w:tcPr/>
+          <w:tcPr>
+            <w:shd w:val="clear" w:color="auto" w:fill="FAFCFE"/>
+          </w:tcPr>
           <w:p>
             <w:pPr>
               <w:pStyle w:val="Compact"/>
@@ -3357,7 +3557,9 @@
           </w:p>
         </w:tc>
         <w:tc>
-          <w:tcPr/>
+          <w:tcPr>
+            <w:shd w:val="clear" w:color="auto" w:fill="FAFCFE"/>
+          </w:tcPr>
           <w:p>
             <w:pPr>
               <w:pStyle w:val="Compact"/>
@@ -3373,7 +3575,9 @@
           </w:p>
         </w:tc>
         <w:tc>
-          <w:tcPr/>
+          <w:tcPr>
+            <w:shd w:val="clear" w:color="auto" w:fill="FAFCFE"/>
+          </w:tcPr>
           <w:p>
             <w:pPr>
               <w:pStyle w:val="Compact"/>

</xml_diff>